<commit_message>
Multiple enhancements on Jun 12-13 2026
</commit_message>
<xml_diff>
--- a/trading_scanner_BRD.docx
+++ b/trading_scanner_BRD.docx
@@ -18377,7 +18377,7 @@
               <w:rPr>
                 <w:b/>
                 <w:bCs/>
-                <w:color w:val="1E6091"/>
+                <w:color w:val="00B050"/>
                 <w:sz w:val="20"/>
                 <w:szCs w:val="20"/>
               </w:rPr>
@@ -18561,7 +18561,7 @@
               <w:rPr>
                 <w:b/>
                 <w:bCs/>
-                <w:color w:val="1E6091"/>
+                <w:color w:val="00B050"/>
                 <w:sz w:val="20"/>
                 <w:szCs w:val="20"/>
               </w:rPr>
@@ -18737,7 +18737,7 @@
               <w:rPr>
                 <w:b/>
                 <w:bCs/>
-                <w:color w:val="1E6091"/>
+                <w:color w:val="00B050"/>
                 <w:sz w:val="20"/>
                 <w:szCs w:val="20"/>
               </w:rPr>
@@ -18911,7 +18911,7 @@
               <w:rPr>
                 <w:b/>
                 <w:bCs/>
-                <w:color w:val="1E6091"/>
+                <w:color w:val="00B050"/>
                 <w:sz w:val="20"/>
                 <w:szCs w:val="20"/>
               </w:rPr>
@@ -19081,11 +19081,16 @@
             </w:tcMar>
           </w:tcPr>
           <w:p>
+            <w:pPr>
+              <w:rPr>
+                <w:color w:val="00B050"/>
+              </w:rPr>
+            </w:pPr>
             <w:r>
               <w:rPr>
                 <w:b/>
                 <w:bCs/>
-                <w:color w:val="1E6091"/>
+                <w:color w:val="00B050"/>
                 <w:sz w:val="20"/>
                 <w:szCs w:val="20"/>
               </w:rPr>
@@ -19255,11 +19260,16 @@
             </w:tcMar>
           </w:tcPr>
           <w:p>
+            <w:pPr>
+              <w:rPr>
+                <w:color w:val="00B050"/>
+              </w:rPr>
+            </w:pPr>
             <w:r>
               <w:rPr>
                 <w:b/>
                 <w:bCs/>
-                <w:color w:val="1E6091"/>
+                <w:color w:val="00B050"/>
                 <w:sz w:val="20"/>
                 <w:szCs w:val="20"/>
               </w:rPr>
@@ -19447,11 +19457,16 @@
             </w:tcMar>
           </w:tcPr>
           <w:p>
+            <w:pPr>
+              <w:rPr>
+                <w:color w:val="00B050"/>
+              </w:rPr>
+            </w:pPr>
             <w:r>
               <w:rPr>
                 <w:b/>
                 <w:bCs/>
-                <w:color w:val="1E6091"/>
+                <w:color w:val="00B050"/>
                 <w:sz w:val="20"/>
                 <w:szCs w:val="20"/>
               </w:rPr>
@@ -19632,11 +19647,16 @@
             </w:tcMar>
           </w:tcPr>
           <w:p>
+            <w:pPr>
+              <w:rPr>
+                <w:color w:val="00B050"/>
+              </w:rPr>
+            </w:pPr>
             <w:r>
               <w:rPr>
                 <w:b/>
                 <w:bCs/>
-                <w:color w:val="1E6091"/>
+                <w:color w:val="00B050"/>
                 <w:sz w:val="20"/>
                 <w:szCs w:val="20"/>
               </w:rPr>
@@ -19816,11 +19836,16 @@
             </w:tcMar>
           </w:tcPr>
           <w:p>
+            <w:pPr>
+              <w:rPr>
+                <w:color w:val="00B050"/>
+              </w:rPr>
+            </w:pPr>
             <w:r>
               <w:rPr>
                 <w:b/>
                 <w:bCs/>
-                <w:color w:val="1E6091"/>
+                <w:color w:val="00B050"/>
                 <w:sz w:val="20"/>
                 <w:szCs w:val="20"/>
               </w:rPr>
@@ -19990,11 +20015,16 @@
             </w:tcMar>
           </w:tcPr>
           <w:p>
+            <w:pPr>
+              <w:rPr>
+                <w:color w:val="00B050"/>
+              </w:rPr>
+            </w:pPr>
             <w:r>
               <w:rPr>
                 <w:b/>
                 <w:bCs/>
-                <w:color w:val="1E6091"/>
+                <w:color w:val="00B050"/>
                 <w:sz w:val="20"/>
                 <w:szCs w:val="20"/>
               </w:rPr>
@@ -20164,11 +20194,16 @@
             </w:tcMar>
           </w:tcPr>
           <w:p>
+            <w:pPr>
+              <w:rPr>
+                <w:color w:val="00B050"/>
+              </w:rPr>
+            </w:pPr>
             <w:r>
               <w:rPr>
                 <w:b/>
                 <w:bCs/>
-                <w:color w:val="1E6091"/>
+                <w:color w:val="00B050"/>
                 <w:sz w:val="20"/>
                 <w:szCs w:val="20"/>
               </w:rPr>
@@ -20338,11 +20373,16 @@
             </w:tcMar>
           </w:tcPr>
           <w:p>
+            <w:pPr>
+              <w:rPr>
+                <w:color w:val="00B050"/>
+              </w:rPr>
+            </w:pPr>
             <w:r>
               <w:rPr>
                 <w:b/>
                 <w:bCs/>
-                <w:color w:val="1E6091"/>
+                <w:color w:val="00B050"/>
                 <w:sz w:val="20"/>
                 <w:szCs w:val="20"/>
               </w:rPr>
@@ -20516,7 +20556,7 @@
               <w:rPr>
                 <w:b/>
                 <w:bCs/>
-                <w:color w:val="1E6091"/>
+                <w:color w:val="00B050"/>
                 <w:sz w:val="20"/>
                 <w:szCs w:val="20"/>
               </w:rPr>
@@ -20686,11 +20726,16 @@
             </w:tcMar>
           </w:tcPr>
           <w:p>
+            <w:pPr>
+              <w:rPr>
+                <w:color w:val="00B050"/>
+              </w:rPr>
+            </w:pPr>
             <w:r>
               <w:rPr>
                 <w:b/>
                 <w:bCs/>
-                <w:color w:val="1E6091"/>
+                <w:color w:val="00B050"/>
                 <w:sz w:val="20"/>
                 <w:szCs w:val="20"/>
               </w:rPr>
@@ -20880,11 +20925,16 @@
             </w:tcMar>
           </w:tcPr>
           <w:p>
+            <w:pPr>
+              <w:rPr>
+                <w:color w:val="00B050"/>
+              </w:rPr>
+            </w:pPr>
             <w:r>
               <w:rPr>
                 <w:b/>
                 <w:bCs/>
-                <w:color w:val="1E6091"/>
+                <w:color w:val="00B050"/>
                 <w:sz w:val="20"/>
                 <w:szCs w:val="20"/>
               </w:rPr>
@@ -21054,11 +21104,16 @@
             </w:tcMar>
           </w:tcPr>
           <w:p>
+            <w:pPr>
+              <w:rPr>
+                <w:color w:val="00B050"/>
+              </w:rPr>
+            </w:pPr>
             <w:r>
               <w:rPr>
                 <w:b/>
                 <w:bCs/>
-                <w:color w:val="1E6091"/>
+                <w:color w:val="00B050"/>
                 <w:sz w:val="20"/>
                 <w:szCs w:val="20"/>
               </w:rPr>
@@ -21228,11 +21283,16 @@
             </w:tcMar>
           </w:tcPr>
           <w:p>
+            <w:pPr>
+              <w:rPr>
+                <w:color w:val="00B050"/>
+              </w:rPr>
+            </w:pPr>
             <w:r>
               <w:rPr>
                 <w:b/>
                 <w:bCs/>
-                <w:color w:val="1E6091"/>
+                <w:color w:val="00B050"/>
                 <w:sz w:val="20"/>
                 <w:szCs w:val="20"/>
               </w:rPr>
@@ -21412,11 +21472,16 @@
             </w:tcMar>
           </w:tcPr>
           <w:p>
+            <w:pPr>
+              <w:rPr>
+                <w:color w:val="00B050"/>
+              </w:rPr>
+            </w:pPr>
             <w:r>
               <w:rPr>
                 <w:b/>
                 <w:bCs/>
-                <w:color w:val="1E6091"/>
+                <w:color w:val="00B050"/>
                 <w:sz w:val="20"/>
                 <w:szCs w:val="20"/>
               </w:rPr>
@@ -21586,11 +21651,16 @@
             </w:tcMar>
           </w:tcPr>
           <w:p>
+            <w:pPr>
+              <w:rPr>
+                <w:color w:val="00B050"/>
+              </w:rPr>
+            </w:pPr>
             <w:r>
               <w:rPr>
                 <w:b/>
                 <w:bCs/>
-                <w:color w:val="1E6091"/>
+                <w:color w:val="00B050"/>
                 <w:sz w:val="20"/>
                 <w:szCs w:val="20"/>
               </w:rPr>
@@ -21778,11 +21848,16 @@
             </w:tcMar>
           </w:tcPr>
           <w:p>
+            <w:pPr>
+              <w:rPr>
+                <w:color w:val="00B050"/>
+              </w:rPr>
+            </w:pPr>
             <w:r>
               <w:rPr>
                 <w:b/>
                 <w:bCs/>
-                <w:color w:val="1E6091"/>
+                <w:color w:val="00B050"/>
                 <w:sz w:val="20"/>
                 <w:szCs w:val="20"/>
               </w:rPr>
@@ -21952,6 +22027,11 @@
             </w:tcMar>
           </w:tcPr>
           <w:p>
+            <w:pPr>
+              <w:rPr>
+                <w:color w:val="00B050"/>
+              </w:rPr>
+            </w:pPr>
             <w:r>
               <w:rPr>
                 <w:b/>
@@ -22126,11 +22206,16 @@
             </w:tcMar>
           </w:tcPr>
           <w:p>
+            <w:pPr>
+              <w:rPr>
+                <w:color w:val="00B050"/>
+              </w:rPr>
+            </w:pPr>
             <w:r>
               <w:rPr>
                 <w:b/>
                 <w:bCs/>
-                <w:color w:val="1E6091"/>
+                <w:color w:val="00B050"/>
                 <w:sz w:val="20"/>
                 <w:szCs w:val="20"/>
               </w:rPr>
@@ -22510,10 +22595,16 @@
             </w:tcMar>
           </w:tcPr>
           <w:p>
+            <w:pPr>
+              <w:rPr>
+                <w:strike/>
+              </w:rPr>
+            </w:pPr>
             <w:r>
               <w:rPr>
                 <w:b/>
                 <w:bCs/>
+                <w:strike/>
                 <w:color w:val="1E6091"/>
                 <w:sz w:val="20"/>
                 <w:szCs w:val="20"/>
@@ -22540,13 +22631,235 @@
             </w:tcMar>
           </w:tcPr>
           <w:p>
-            <w:r>
-              <w:rPr>
+            <w:pPr>
+              <w:rPr>
+                <w:strike/>
+              </w:rPr>
+            </w:pPr>
+            <w:r>
+              <w:rPr>
+                <w:strike/>
                 <w:color w:val="000000"/>
                 <w:sz w:val="20"/>
                 <w:szCs w:val="20"/>
               </w:rPr>
               <w:t>SMS alerts for A+ conviction picks — Twilio integration for mobile push on highest-conviction signals</w:t>
+            </w:r>
+          </w:p>
+        </w:tc>
+        <w:tc>
+          <w:tcPr>
+            <w:tcW w:w="1400" w:type="dxa"/>
+            <w:tcBorders>
+              <w:top w:val="single" w:sz="1" w:space="0" w:color="DDDDDD"/>
+              <w:left w:val="single" w:sz="1" w:space="0" w:color="DDDDDD"/>
+              <w:bottom w:val="single" w:sz="1" w:space="0" w:color="DDDDDD"/>
+              <w:right w:val="single" w:sz="1" w:space="0" w:color="DDDDDD"/>
+            </w:tcBorders>
+            <w:shd w:val="clear" w:color="auto" w:fill="F2F2F2"/>
+            <w:tcMar>
+              <w:top w:w="80" w:type="dxa"/>
+              <w:left w:w="120" w:type="dxa"/>
+              <w:bottom w:w="80" w:type="dxa"/>
+              <w:right w:w="120" w:type="dxa"/>
+            </w:tcMar>
+          </w:tcPr>
+          <w:p>
+            <w:pPr>
+              <w:rPr>
+                <w:strike/>
+              </w:rPr>
+            </w:pPr>
+            <w:r>
+              <w:rPr>
+                <w:b/>
+                <w:bCs/>
+                <w:strike/>
+                <w:color w:val="595959"/>
+                <w:sz w:val="19"/>
+                <w:szCs w:val="19"/>
+              </w:rPr>
+              <w:t>P4 — Low</w:t>
+            </w:r>
+          </w:p>
+        </w:tc>
+        <w:tc>
+          <w:tcPr>
+            <w:tcW w:w="1100" w:type="dxa"/>
+            <w:tcBorders>
+              <w:top w:val="single" w:sz="1" w:space="0" w:color="DDDDDD"/>
+              <w:left w:val="single" w:sz="1" w:space="0" w:color="DDDDDD"/>
+              <w:bottom w:val="single" w:sz="1" w:space="0" w:color="DDDDDD"/>
+              <w:right w:val="single" w:sz="1" w:space="0" w:color="DDDDDD"/>
+            </w:tcBorders>
+            <w:shd w:val="clear" w:color="auto" w:fill="F2F2F2"/>
+            <w:tcMar>
+              <w:top w:w="80" w:type="dxa"/>
+              <w:left w:w="120" w:type="dxa"/>
+              <w:bottom w:w="80" w:type="dxa"/>
+              <w:right w:w="120" w:type="dxa"/>
+            </w:tcMar>
+          </w:tcPr>
+          <w:p>
+            <w:pPr>
+              <w:rPr>
+                <w:strike/>
+              </w:rPr>
+            </w:pPr>
+            <w:r>
+              <w:rPr>
+                <w:strike/>
+                <w:color w:val="000000"/>
+                <w:sz w:val="20"/>
+                <w:szCs w:val="20"/>
+              </w:rPr>
+              <w:t>Low</w:t>
+            </w:r>
+          </w:p>
+        </w:tc>
+        <w:tc>
+          <w:tcPr>
+            <w:tcW w:w="1100" w:type="dxa"/>
+            <w:tcBorders>
+              <w:top w:val="single" w:sz="1" w:space="0" w:color="DDDDDD"/>
+              <w:left w:val="single" w:sz="1" w:space="0" w:color="DDDDDD"/>
+              <w:bottom w:val="single" w:sz="1" w:space="0" w:color="DDDDDD"/>
+              <w:right w:val="single" w:sz="1" w:space="0" w:color="DDDDDD"/>
+            </w:tcBorders>
+            <w:shd w:val="clear" w:color="auto" w:fill="F2F2F2"/>
+            <w:tcMar>
+              <w:top w:w="80" w:type="dxa"/>
+              <w:left w:w="120" w:type="dxa"/>
+              <w:bottom w:w="80" w:type="dxa"/>
+              <w:right w:w="120" w:type="dxa"/>
+            </w:tcMar>
+          </w:tcPr>
+          <w:p>
+            <w:pPr>
+              <w:rPr>
+                <w:strike/>
+              </w:rPr>
+            </w:pPr>
+            <w:r>
+              <w:rPr>
+                <w:strike/>
+                <w:color w:val="000000"/>
+                <w:sz w:val="20"/>
+                <w:szCs w:val="20"/>
+              </w:rPr>
+              <w:t>Low</w:t>
+            </w:r>
+          </w:p>
+        </w:tc>
+        <w:tc>
+          <w:tcPr>
+            <w:tcW w:w="1560" w:type="dxa"/>
+            <w:tcBorders>
+              <w:top w:val="single" w:sz="1" w:space="0" w:color="DDDDDD"/>
+              <w:left w:val="single" w:sz="1" w:space="0" w:color="DDDDDD"/>
+              <w:bottom w:val="single" w:sz="1" w:space="0" w:color="DDDDDD"/>
+              <w:right w:val="single" w:sz="1" w:space="0" w:color="DDDDDD"/>
+            </w:tcBorders>
+            <w:shd w:val="clear" w:color="auto" w:fill="F2F2F2"/>
+            <w:tcMar>
+              <w:top w:w="80" w:type="dxa"/>
+              <w:left w:w="120" w:type="dxa"/>
+              <w:bottom w:w="80" w:type="dxa"/>
+              <w:right w:w="120" w:type="dxa"/>
+            </w:tcMar>
+          </w:tcPr>
+          <w:p>
+            <w:pPr>
+              <w:rPr>
+                <w:strike/>
+              </w:rPr>
+            </w:pPr>
+            <w:r>
+              <w:rPr>
+                <w:strike/>
+                <w:color w:val="000000"/>
+                <w:sz w:val="20"/>
+                <w:szCs w:val="20"/>
+              </w:rPr>
+              <w:t>utils/sms_sender.py</w:t>
+            </w:r>
+          </w:p>
+        </w:tc>
+      </w:tr>
+      <w:tr>
+        <w:tc>
+          <w:tcPr>
+            <w:tcW w:w="1000" w:type="dxa"/>
+            <w:tcBorders>
+              <w:top w:val="single" w:sz="1" w:space="0" w:color="DDDDDD"/>
+              <w:left w:val="single" w:sz="1" w:space="0" w:color="DDDDDD"/>
+              <w:bottom w:val="single" w:sz="1" w:space="0" w:color="DDDDDD"/>
+              <w:right w:val="single" w:sz="1" w:space="0" w:color="DDDDDD"/>
+            </w:tcBorders>
+            <w:shd w:val="clear" w:color="auto" w:fill="FFFFFF"/>
+            <w:tcMar>
+              <w:top w:w="80" w:type="dxa"/>
+              <w:left w:w="120" w:type="dxa"/>
+              <w:bottom w:w="80" w:type="dxa"/>
+              <w:right w:w="120" w:type="dxa"/>
+            </w:tcMar>
+          </w:tcPr>
+          <w:p>
+            <w:r>
+              <w:rPr>
+                <w:b/>
+                <w:bCs/>
+                <w:color w:val="00B050"/>
+                <w:sz w:val="20"/>
+                <w:szCs w:val="20"/>
+              </w:rPr>
+              <w:t>ENH-25</w:t>
+            </w:r>
+          </w:p>
+        </w:tc>
+        <w:tc>
+          <w:tcPr>
+            <w:tcW w:w="3200" w:type="dxa"/>
+            <w:tcBorders>
+              <w:top w:val="single" w:sz="1" w:space="0" w:color="DDDDDD"/>
+              <w:left w:val="single" w:sz="1" w:space="0" w:color="DDDDDD"/>
+              <w:bottom w:val="single" w:sz="1" w:space="0" w:color="DDDDDD"/>
+              <w:right w:val="single" w:sz="1" w:space="0" w:color="DDDDDD"/>
+            </w:tcBorders>
+            <w:shd w:val="clear" w:color="auto" w:fill="FFFFFF"/>
+            <w:tcMar>
+              <w:top w:w="80" w:type="dxa"/>
+              <w:left w:w="120" w:type="dxa"/>
+              <w:bottom w:w="80" w:type="dxa"/>
+              <w:right w:w="120" w:type="dxa"/>
+            </w:tcMar>
+          </w:tcPr>
+          <w:p>
+            <w:r>
+              <w:rPr>
+                <w:color w:val="000000"/>
+                <w:sz w:val="20"/>
+                <w:szCs w:val="20"/>
+              </w:rPr>
+              <w:t xml:space="preserve">Ticker alias resolution — map BRK.B → BRK-B, </w:t>
+            </w:r>
+            <w:proofErr w:type="gramStart"/>
+            <w:r>
+              <w:rPr>
+                <w:color w:val="000000"/>
+                <w:sz w:val="20"/>
+                <w:szCs w:val="20"/>
+              </w:rPr>
+              <w:t>BF.B</w:t>
+            </w:r>
+            <w:proofErr w:type="gramEnd"/>
+            <w:r>
+              <w:rPr>
+                <w:color w:val="000000"/>
+                <w:sz w:val="20"/>
+                <w:szCs w:val="20"/>
+              </w:rPr>
+              <w:t xml:space="preserve"> → BF-B automatically across data providers</w:t>
             </w:r>
           </w:p>
         </w:tc>
@@ -22589,7 +22902,7 @@
               <w:bottom w:val="single" w:sz="1" w:space="0" w:color="DDDDDD"/>
               <w:right w:val="single" w:sz="1" w:space="0" w:color="DDDDDD"/>
             </w:tcBorders>
-            <w:shd w:val="clear" w:color="auto" w:fill="F2F2F2"/>
+            <w:shd w:val="clear" w:color="auto" w:fill="FFFFFF"/>
             <w:tcMar>
               <w:top w:w="80" w:type="dxa"/>
               <w:left w:w="120" w:type="dxa"/>
@@ -22617,22 +22930,22 @@
               <w:bottom w:val="single" w:sz="1" w:space="0" w:color="DDDDDD"/>
               <w:right w:val="single" w:sz="1" w:space="0" w:color="DDDDDD"/>
             </w:tcBorders>
-            <w:shd w:val="clear" w:color="auto" w:fill="F2F2F2"/>
-            <w:tcMar>
-              <w:top w:w="80" w:type="dxa"/>
-              <w:left w:w="120" w:type="dxa"/>
-              <w:bottom w:w="80" w:type="dxa"/>
-              <w:right w:w="120" w:type="dxa"/>
-            </w:tcMar>
-          </w:tcPr>
-          <w:p>
-            <w:r>
-              <w:rPr>
-                <w:color w:val="000000"/>
-                <w:sz w:val="20"/>
-                <w:szCs w:val="20"/>
-              </w:rPr>
-              <w:t>Low</w:t>
+            <w:shd w:val="clear" w:color="auto" w:fill="FFFFFF"/>
+            <w:tcMar>
+              <w:top w:w="80" w:type="dxa"/>
+              <w:left w:w="120" w:type="dxa"/>
+              <w:bottom w:w="80" w:type="dxa"/>
+              <w:right w:w="120" w:type="dxa"/>
+            </w:tcMar>
+          </w:tcPr>
+          <w:p>
+            <w:r>
+              <w:rPr>
+                <w:color w:val="000000"/>
+                <w:sz w:val="20"/>
+                <w:szCs w:val="20"/>
+              </w:rPr>
+              <w:t>Medium</w:t>
             </w:r>
           </w:p>
         </w:tc>
@@ -22645,22 +22958,22 @@
               <w:bottom w:val="single" w:sz="1" w:space="0" w:color="DDDDDD"/>
               <w:right w:val="single" w:sz="1" w:space="0" w:color="DDDDDD"/>
             </w:tcBorders>
-            <w:shd w:val="clear" w:color="auto" w:fill="F2F2F2"/>
-            <w:tcMar>
-              <w:top w:w="80" w:type="dxa"/>
-              <w:left w:w="120" w:type="dxa"/>
-              <w:bottom w:w="80" w:type="dxa"/>
-              <w:right w:w="120" w:type="dxa"/>
-            </w:tcMar>
-          </w:tcPr>
-          <w:p>
-            <w:r>
-              <w:rPr>
-                <w:color w:val="000000"/>
-                <w:sz w:val="20"/>
-                <w:szCs w:val="20"/>
-              </w:rPr>
-              <w:t>utils/sms_sender.py</w:t>
+            <w:shd w:val="clear" w:color="auto" w:fill="FFFFFF"/>
+            <w:tcMar>
+              <w:top w:w="80" w:type="dxa"/>
+              <w:left w:w="120" w:type="dxa"/>
+              <w:bottom w:w="80" w:type="dxa"/>
+              <w:right w:w="120" w:type="dxa"/>
+            </w:tcMar>
+          </w:tcPr>
+          <w:p>
+            <w:r>
+              <w:rPr>
+                <w:color w:val="000000"/>
+                <w:sz w:val="20"/>
+                <w:szCs w:val="20"/>
+              </w:rPr>
+              <w:t>universes.py</w:t>
             </w:r>
           </w:p>
         </w:tc>
@@ -22675,7 +22988,7 @@
               <w:bottom w:val="single" w:sz="1" w:space="0" w:color="DDDDDD"/>
               <w:right w:val="single" w:sz="1" w:space="0" w:color="DDDDDD"/>
             </w:tcBorders>
-            <w:shd w:val="clear" w:color="auto" w:fill="FFFFFF"/>
+            <w:shd w:val="clear" w:color="auto" w:fill="F2F2F2"/>
             <w:tcMar>
               <w:top w:w="80" w:type="dxa"/>
               <w:left w:w="120" w:type="dxa"/>
@@ -22692,7 +23005,7 @@
                 <w:sz w:val="20"/>
                 <w:szCs w:val="20"/>
               </w:rPr>
-              <w:t>ENH-25</w:t>
+              <w:t>ENH-26</w:t>
             </w:r>
           </w:p>
         </w:tc>
@@ -22705,40 +23018,40 @@
               <w:bottom w:val="single" w:sz="1" w:space="0" w:color="DDDDDD"/>
               <w:right w:val="single" w:sz="1" w:space="0" w:color="DDDDDD"/>
             </w:tcBorders>
-            <w:shd w:val="clear" w:color="auto" w:fill="FFFFFF"/>
-            <w:tcMar>
-              <w:top w:w="80" w:type="dxa"/>
-              <w:left w:w="120" w:type="dxa"/>
-              <w:bottom w:w="80" w:type="dxa"/>
-              <w:right w:w="120" w:type="dxa"/>
-            </w:tcMar>
-          </w:tcPr>
-          <w:p>
-            <w:r>
-              <w:rPr>
-                <w:color w:val="000000"/>
-                <w:sz w:val="20"/>
-                <w:szCs w:val="20"/>
-              </w:rPr>
-              <w:t xml:space="preserve">Ticker alias resolution — map BRK.B → BRK-B, </w:t>
-            </w:r>
-            <w:proofErr w:type="gramStart"/>
-            <w:r>
-              <w:rPr>
-                <w:color w:val="000000"/>
-                <w:sz w:val="20"/>
-                <w:szCs w:val="20"/>
-              </w:rPr>
-              <w:t>BF.B</w:t>
-            </w:r>
-            <w:proofErr w:type="gramEnd"/>
-            <w:r>
-              <w:rPr>
-                <w:color w:val="000000"/>
-                <w:sz w:val="20"/>
-                <w:szCs w:val="20"/>
-              </w:rPr>
-              <w:t xml:space="preserve"> → BF-B automatically across data providers</w:t>
+            <w:shd w:val="clear" w:color="auto" w:fill="F2F2F2"/>
+            <w:tcMar>
+              <w:top w:w="80" w:type="dxa"/>
+              <w:left w:w="120" w:type="dxa"/>
+              <w:bottom w:w="80" w:type="dxa"/>
+              <w:right w:w="120" w:type="dxa"/>
+            </w:tcMar>
+          </w:tcPr>
+          <w:p>
+            <w:r>
+              <w:rPr>
+                <w:color w:val="000000"/>
+                <w:sz w:val="20"/>
+                <w:szCs w:val="20"/>
+              </w:rPr>
+              <w:t xml:space="preserve">Docker containerization — </w:t>
+            </w:r>
+            <w:proofErr w:type="spellStart"/>
+            <w:r>
+              <w:rPr>
+                <w:color w:val="000000"/>
+                <w:sz w:val="20"/>
+                <w:szCs w:val="20"/>
+              </w:rPr>
+              <w:t>Dockerfile</w:t>
+            </w:r>
+            <w:proofErr w:type="spellEnd"/>
+            <w:r>
+              <w:rPr>
+                <w:color w:val="000000"/>
+                <w:sz w:val="20"/>
+                <w:szCs w:val="20"/>
+              </w:rPr>
+              <w:t xml:space="preserve"> for reproducible local and cloud execution</w:t>
             </w:r>
           </w:p>
         </w:tc>
@@ -22781,7 +23094,7 @@
               <w:bottom w:val="single" w:sz="1" w:space="0" w:color="DDDDDD"/>
               <w:right w:val="single" w:sz="1" w:space="0" w:color="DDDDDD"/>
             </w:tcBorders>
-            <w:shd w:val="clear" w:color="auto" w:fill="FFFFFF"/>
+            <w:shd w:val="clear" w:color="auto" w:fill="F2F2F2"/>
             <w:tcMar>
               <w:top w:w="80" w:type="dxa"/>
               <w:left w:w="120" w:type="dxa"/>
@@ -22809,7 +23122,7 @@
               <w:bottom w:val="single" w:sz="1" w:space="0" w:color="DDDDDD"/>
               <w:right w:val="single" w:sz="1" w:space="0" w:color="DDDDDD"/>
             </w:tcBorders>
-            <w:shd w:val="clear" w:color="auto" w:fill="FFFFFF"/>
+            <w:shd w:val="clear" w:color="auto" w:fill="F2F2F2"/>
             <w:tcMar>
               <w:top w:w="80" w:type="dxa"/>
               <w:left w:w="120" w:type="dxa"/>
@@ -22837,22 +23150,22 @@
               <w:bottom w:val="single" w:sz="1" w:space="0" w:color="DDDDDD"/>
               <w:right w:val="single" w:sz="1" w:space="0" w:color="DDDDDD"/>
             </w:tcBorders>
-            <w:shd w:val="clear" w:color="auto" w:fill="FFFFFF"/>
-            <w:tcMar>
-              <w:top w:w="80" w:type="dxa"/>
-              <w:left w:w="120" w:type="dxa"/>
-              <w:bottom w:w="80" w:type="dxa"/>
-              <w:right w:w="120" w:type="dxa"/>
-            </w:tcMar>
-          </w:tcPr>
-          <w:p>
-            <w:r>
-              <w:rPr>
-                <w:color w:val="000000"/>
-                <w:sz w:val="20"/>
-                <w:szCs w:val="20"/>
-              </w:rPr>
-              <w:t>universes.py</w:t>
+            <w:shd w:val="clear" w:color="auto" w:fill="F2F2F2"/>
+            <w:tcMar>
+              <w:top w:w="80" w:type="dxa"/>
+              <w:left w:w="120" w:type="dxa"/>
+              <w:bottom w:w="80" w:type="dxa"/>
+              <w:right w:w="120" w:type="dxa"/>
+            </w:tcMar>
+          </w:tcPr>
+          <w:p>
+            <w:r>
+              <w:rPr>
+                <w:color w:val="000000"/>
+                <w:sz w:val="20"/>
+                <w:szCs w:val="20"/>
+              </w:rPr>
+              <w:t>Infra</w:t>
             </w:r>
           </w:p>
         </w:tc>
@@ -22867,24 +23180,30 @@
               <w:bottom w:val="single" w:sz="1" w:space="0" w:color="DDDDDD"/>
               <w:right w:val="single" w:sz="1" w:space="0" w:color="DDDDDD"/>
             </w:tcBorders>
-            <w:shd w:val="clear" w:color="auto" w:fill="F2F2F2"/>
-            <w:tcMar>
-              <w:top w:w="80" w:type="dxa"/>
-              <w:left w:w="120" w:type="dxa"/>
-              <w:bottom w:w="80" w:type="dxa"/>
-              <w:right w:w="120" w:type="dxa"/>
-            </w:tcMar>
-          </w:tcPr>
-          <w:p>
+            <w:shd w:val="clear" w:color="auto" w:fill="FFFFFF"/>
+            <w:tcMar>
+              <w:top w:w="80" w:type="dxa"/>
+              <w:left w:w="120" w:type="dxa"/>
+              <w:bottom w:w="80" w:type="dxa"/>
+              <w:right w:w="120" w:type="dxa"/>
+            </w:tcMar>
+          </w:tcPr>
+          <w:p>
+            <w:pPr>
+              <w:rPr>
+                <w:strike/>
+              </w:rPr>
+            </w:pPr>
             <w:r>
               <w:rPr>
                 <w:b/>
                 <w:bCs/>
+                <w:strike/>
                 <w:color w:val="1E6091"/>
                 <w:sz w:val="20"/>
                 <w:szCs w:val="20"/>
               </w:rPr>
-              <w:t>ENH-26</w:t>
+              <w:t>ENH-27</w:t>
             </w:r>
           </w:p>
         </w:tc>
@@ -22897,40 +23216,28 @@
               <w:bottom w:val="single" w:sz="1" w:space="0" w:color="DDDDDD"/>
               <w:right w:val="single" w:sz="1" w:space="0" w:color="DDDDDD"/>
             </w:tcBorders>
-            <w:shd w:val="clear" w:color="auto" w:fill="F2F2F2"/>
-            <w:tcMar>
-              <w:top w:w="80" w:type="dxa"/>
-              <w:left w:w="120" w:type="dxa"/>
-              <w:bottom w:w="80" w:type="dxa"/>
-              <w:right w:w="120" w:type="dxa"/>
-            </w:tcMar>
-          </w:tcPr>
-          <w:p>
-            <w:r>
-              <w:rPr>
-                <w:color w:val="000000"/>
-                <w:sz w:val="20"/>
-                <w:szCs w:val="20"/>
-              </w:rPr>
-              <w:t xml:space="preserve">Docker containerization — </w:t>
-            </w:r>
-            <w:proofErr w:type="spellStart"/>
-            <w:r>
-              <w:rPr>
-                <w:color w:val="000000"/>
-                <w:sz w:val="20"/>
-                <w:szCs w:val="20"/>
-              </w:rPr>
-              <w:t>Dockerfile</w:t>
-            </w:r>
-            <w:proofErr w:type="spellEnd"/>
-            <w:r>
-              <w:rPr>
-                <w:color w:val="000000"/>
-                <w:sz w:val="20"/>
-                <w:szCs w:val="20"/>
-              </w:rPr>
-              <w:t xml:space="preserve"> for reproducible local and cloud execution</w:t>
+            <w:shd w:val="clear" w:color="auto" w:fill="FFFFFF"/>
+            <w:tcMar>
+              <w:top w:w="80" w:type="dxa"/>
+              <w:left w:w="120" w:type="dxa"/>
+              <w:bottom w:w="80" w:type="dxa"/>
+              <w:right w:w="120" w:type="dxa"/>
+            </w:tcMar>
+          </w:tcPr>
+          <w:p>
+            <w:pPr>
+              <w:rPr>
+                <w:strike/>
+              </w:rPr>
+            </w:pPr>
+            <w:r>
+              <w:rPr>
+                <w:strike/>
+                <w:color w:val="000000"/>
+                <w:sz w:val="20"/>
+                <w:szCs w:val="20"/>
+              </w:rPr>
+              <w:t>Slack webhook notification — post top picks card to Slack channel on each scan</w:t>
             </w:r>
           </w:p>
         </w:tc>
@@ -22952,10 +23259,16 @@
             </w:tcMar>
           </w:tcPr>
           <w:p>
+            <w:pPr>
+              <w:rPr>
+                <w:strike/>
+              </w:rPr>
+            </w:pPr>
             <w:r>
               <w:rPr>
                 <w:b/>
                 <w:bCs/>
+                <w:strike/>
                 <w:color w:val="595959"/>
                 <w:sz w:val="19"/>
                 <w:szCs w:val="19"/>
@@ -22973,17 +23286,23 @@
               <w:bottom w:val="single" w:sz="1" w:space="0" w:color="DDDDDD"/>
               <w:right w:val="single" w:sz="1" w:space="0" w:color="DDDDDD"/>
             </w:tcBorders>
-            <w:shd w:val="clear" w:color="auto" w:fill="F2F2F2"/>
-            <w:tcMar>
-              <w:top w:w="80" w:type="dxa"/>
-              <w:left w:w="120" w:type="dxa"/>
-              <w:bottom w:w="80" w:type="dxa"/>
-              <w:right w:w="120" w:type="dxa"/>
-            </w:tcMar>
-          </w:tcPr>
-          <w:p>
-            <w:r>
-              <w:rPr>
+            <w:shd w:val="clear" w:color="auto" w:fill="FFFFFF"/>
+            <w:tcMar>
+              <w:top w:w="80" w:type="dxa"/>
+              <w:left w:w="120" w:type="dxa"/>
+              <w:bottom w:w="80" w:type="dxa"/>
+              <w:right w:w="120" w:type="dxa"/>
+            </w:tcMar>
+          </w:tcPr>
+          <w:p>
+            <w:pPr>
+              <w:rPr>
+                <w:strike/>
+              </w:rPr>
+            </w:pPr>
+            <w:r>
+              <w:rPr>
+                <w:strike/>
                 <w:color w:val="000000"/>
                 <w:sz w:val="20"/>
                 <w:szCs w:val="20"/>
@@ -23001,22 +23320,28 @@
               <w:bottom w:val="single" w:sz="1" w:space="0" w:color="DDDDDD"/>
               <w:right w:val="single" w:sz="1" w:space="0" w:color="DDDDDD"/>
             </w:tcBorders>
-            <w:shd w:val="clear" w:color="auto" w:fill="F2F2F2"/>
-            <w:tcMar>
-              <w:top w:w="80" w:type="dxa"/>
-              <w:left w:w="120" w:type="dxa"/>
-              <w:bottom w:w="80" w:type="dxa"/>
-              <w:right w:w="120" w:type="dxa"/>
-            </w:tcMar>
-          </w:tcPr>
-          <w:p>
-            <w:r>
-              <w:rPr>
-                <w:color w:val="000000"/>
-                <w:sz w:val="20"/>
-                <w:szCs w:val="20"/>
-              </w:rPr>
-              <w:t>Medium</w:t>
+            <w:shd w:val="clear" w:color="auto" w:fill="FFFFFF"/>
+            <w:tcMar>
+              <w:top w:w="80" w:type="dxa"/>
+              <w:left w:w="120" w:type="dxa"/>
+              <w:bottom w:w="80" w:type="dxa"/>
+              <w:right w:w="120" w:type="dxa"/>
+            </w:tcMar>
+          </w:tcPr>
+          <w:p>
+            <w:pPr>
+              <w:rPr>
+                <w:strike/>
+              </w:rPr>
+            </w:pPr>
+            <w:r>
+              <w:rPr>
+                <w:strike/>
+                <w:color w:val="000000"/>
+                <w:sz w:val="20"/>
+                <w:szCs w:val="20"/>
+              </w:rPr>
+              <w:t>Low</w:t>
             </w:r>
           </w:p>
         </w:tc>
@@ -23029,22 +23354,28 @@
               <w:bottom w:val="single" w:sz="1" w:space="0" w:color="DDDDDD"/>
               <w:right w:val="single" w:sz="1" w:space="0" w:color="DDDDDD"/>
             </w:tcBorders>
-            <w:shd w:val="clear" w:color="auto" w:fill="F2F2F2"/>
-            <w:tcMar>
-              <w:top w:w="80" w:type="dxa"/>
-              <w:left w:w="120" w:type="dxa"/>
-              <w:bottom w:w="80" w:type="dxa"/>
-              <w:right w:w="120" w:type="dxa"/>
-            </w:tcMar>
-          </w:tcPr>
-          <w:p>
-            <w:r>
-              <w:rPr>
-                <w:color w:val="000000"/>
-                <w:sz w:val="20"/>
-                <w:szCs w:val="20"/>
-              </w:rPr>
-              <w:t>Infra</w:t>
+            <w:shd w:val="clear" w:color="auto" w:fill="FFFFFF"/>
+            <w:tcMar>
+              <w:top w:w="80" w:type="dxa"/>
+              <w:left w:w="120" w:type="dxa"/>
+              <w:bottom w:w="80" w:type="dxa"/>
+              <w:right w:w="120" w:type="dxa"/>
+            </w:tcMar>
+          </w:tcPr>
+          <w:p>
+            <w:pPr>
+              <w:rPr>
+                <w:strike/>
+              </w:rPr>
+            </w:pPr>
+            <w:r>
+              <w:rPr>
+                <w:strike/>
+                <w:color w:val="000000"/>
+                <w:sz w:val="20"/>
+                <w:szCs w:val="20"/>
+              </w:rPr>
+              <w:t>utils/slack_sender.py</w:t>
             </w:r>
           </w:p>
         </w:tc>
@@ -23059,24 +23390,30 @@
               <w:bottom w:val="single" w:sz="1" w:space="0" w:color="DDDDDD"/>
               <w:right w:val="single" w:sz="1" w:space="0" w:color="DDDDDD"/>
             </w:tcBorders>
-            <w:shd w:val="clear" w:color="auto" w:fill="FFFFFF"/>
-            <w:tcMar>
-              <w:top w:w="80" w:type="dxa"/>
-              <w:left w:w="120" w:type="dxa"/>
-              <w:bottom w:w="80" w:type="dxa"/>
-              <w:right w:w="120" w:type="dxa"/>
-            </w:tcMar>
-          </w:tcPr>
-          <w:p>
+            <w:shd w:val="clear" w:color="auto" w:fill="F2F2F2"/>
+            <w:tcMar>
+              <w:top w:w="80" w:type="dxa"/>
+              <w:left w:w="120" w:type="dxa"/>
+              <w:bottom w:w="80" w:type="dxa"/>
+              <w:right w:w="120" w:type="dxa"/>
+            </w:tcMar>
+          </w:tcPr>
+          <w:p>
+            <w:pPr>
+              <w:rPr>
+                <w:strike/>
+              </w:rPr>
+            </w:pPr>
             <w:r>
               <w:rPr>
                 <w:b/>
                 <w:bCs/>
+                <w:strike/>
                 <w:color w:val="1E6091"/>
                 <w:sz w:val="20"/>
                 <w:szCs w:val="20"/>
               </w:rPr>
-              <w:t>ENH-27</w:t>
+              <w:t>ENH-28</w:t>
             </w:r>
           </w:p>
         </w:tc>
@@ -23089,22 +23426,28 @@
               <w:bottom w:val="single" w:sz="1" w:space="0" w:color="DDDDDD"/>
               <w:right w:val="single" w:sz="1" w:space="0" w:color="DDDDDD"/>
             </w:tcBorders>
-            <w:shd w:val="clear" w:color="auto" w:fill="FFFFFF"/>
-            <w:tcMar>
-              <w:top w:w="80" w:type="dxa"/>
-              <w:left w:w="120" w:type="dxa"/>
-              <w:bottom w:w="80" w:type="dxa"/>
-              <w:right w:w="120" w:type="dxa"/>
-            </w:tcMar>
-          </w:tcPr>
-          <w:p>
-            <w:r>
-              <w:rPr>
-                <w:color w:val="000000"/>
-                <w:sz w:val="20"/>
-                <w:szCs w:val="20"/>
-              </w:rPr>
-              <w:t>Slack webhook notification — post top picks card to Slack channel on each scan</w:t>
+            <w:shd w:val="clear" w:color="auto" w:fill="F2F2F2"/>
+            <w:tcMar>
+              <w:top w:w="80" w:type="dxa"/>
+              <w:left w:w="120" w:type="dxa"/>
+              <w:bottom w:w="80" w:type="dxa"/>
+              <w:right w:w="120" w:type="dxa"/>
+            </w:tcMar>
+          </w:tcPr>
+          <w:p>
+            <w:pPr>
+              <w:rPr>
+                <w:strike/>
+              </w:rPr>
+            </w:pPr>
+            <w:r>
+              <w:rPr>
+                <w:strike/>
+                <w:color w:val="000000"/>
+                <w:sz w:val="20"/>
+                <w:szCs w:val="20"/>
+              </w:rPr>
+              <w:t>Interactive CLI — prompt-based universe/filter selection instead of flags-only</w:t>
             </w:r>
           </w:p>
         </w:tc>
@@ -23126,10 +23469,16 @@
             </w:tcMar>
           </w:tcPr>
           <w:p>
+            <w:pPr>
+              <w:rPr>
+                <w:strike/>
+              </w:rPr>
+            </w:pPr>
             <w:r>
               <w:rPr>
                 <w:b/>
                 <w:bCs/>
+                <w:strike/>
                 <w:color w:val="595959"/>
                 <w:sz w:val="19"/>
                 <w:szCs w:val="19"/>
@@ -23147,17 +23496,23 @@
               <w:bottom w:val="single" w:sz="1" w:space="0" w:color="DDDDDD"/>
               <w:right w:val="single" w:sz="1" w:space="0" w:color="DDDDDD"/>
             </w:tcBorders>
-            <w:shd w:val="clear" w:color="auto" w:fill="FFFFFF"/>
-            <w:tcMar>
-              <w:top w:w="80" w:type="dxa"/>
-              <w:left w:w="120" w:type="dxa"/>
-              <w:bottom w:w="80" w:type="dxa"/>
-              <w:right w:w="120" w:type="dxa"/>
-            </w:tcMar>
-          </w:tcPr>
-          <w:p>
-            <w:r>
-              <w:rPr>
+            <w:shd w:val="clear" w:color="auto" w:fill="F2F2F2"/>
+            <w:tcMar>
+              <w:top w:w="80" w:type="dxa"/>
+              <w:left w:w="120" w:type="dxa"/>
+              <w:bottom w:w="80" w:type="dxa"/>
+              <w:right w:w="120" w:type="dxa"/>
+            </w:tcMar>
+          </w:tcPr>
+          <w:p>
+            <w:pPr>
+              <w:rPr>
+                <w:strike/>
+              </w:rPr>
+            </w:pPr>
+            <w:r>
+              <w:rPr>
+                <w:strike/>
                 <w:color w:val="000000"/>
                 <w:sz w:val="20"/>
                 <w:szCs w:val="20"/>
@@ -23175,17 +23530,23 @@
               <w:bottom w:val="single" w:sz="1" w:space="0" w:color="DDDDDD"/>
               <w:right w:val="single" w:sz="1" w:space="0" w:color="DDDDDD"/>
             </w:tcBorders>
-            <w:shd w:val="clear" w:color="auto" w:fill="FFFFFF"/>
-            <w:tcMar>
-              <w:top w:w="80" w:type="dxa"/>
-              <w:left w:w="120" w:type="dxa"/>
-              <w:bottom w:w="80" w:type="dxa"/>
-              <w:right w:w="120" w:type="dxa"/>
-            </w:tcMar>
-          </w:tcPr>
-          <w:p>
-            <w:r>
-              <w:rPr>
+            <w:shd w:val="clear" w:color="auto" w:fill="F2F2F2"/>
+            <w:tcMar>
+              <w:top w:w="80" w:type="dxa"/>
+              <w:left w:w="120" w:type="dxa"/>
+              <w:bottom w:w="80" w:type="dxa"/>
+              <w:right w:w="120" w:type="dxa"/>
+            </w:tcMar>
+          </w:tcPr>
+          <w:p>
+            <w:pPr>
+              <w:rPr>
+                <w:strike/>
+              </w:rPr>
+            </w:pPr>
+            <w:r>
+              <w:rPr>
+                <w:strike/>
                 <w:color w:val="000000"/>
                 <w:sz w:val="20"/>
                 <w:szCs w:val="20"/>
@@ -23203,191 +23564,23 @@
               <w:bottom w:val="single" w:sz="1" w:space="0" w:color="DDDDDD"/>
               <w:right w:val="single" w:sz="1" w:space="0" w:color="DDDDDD"/>
             </w:tcBorders>
-            <w:shd w:val="clear" w:color="auto" w:fill="FFFFFF"/>
-            <w:tcMar>
-              <w:top w:w="80" w:type="dxa"/>
-              <w:left w:w="120" w:type="dxa"/>
-              <w:bottom w:w="80" w:type="dxa"/>
-              <w:right w:w="120" w:type="dxa"/>
-            </w:tcMar>
-          </w:tcPr>
-          <w:p>
-            <w:r>
-              <w:rPr>
-                <w:color w:val="000000"/>
-                <w:sz w:val="20"/>
-                <w:szCs w:val="20"/>
-              </w:rPr>
-              <w:t>utils/slack_sender.py</w:t>
-            </w:r>
-          </w:p>
-        </w:tc>
-      </w:tr>
-      <w:tr>
-        <w:tc>
-          <w:tcPr>
-            <w:tcW w:w="1000" w:type="dxa"/>
-            <w:tcBorders>
-              <w:top w:val="single" w:sz="1" w:space="0" w:color="DDDDDD"/>
-              <w:left w:val="single" w:sz="1" w:space="0" w:color="DDDDDD"/>
-              <w:bottom w:val="single" w:sz="1" w:space="0" w:color="DDDDDD"/>
-              <w:right w:val="single" w:sz="1" w:space="0" w:color="DDDDDD"/>
-            </w:tcBorders>
-            <w:shd w:val="clear" w:color="auto" w:fill="F2F2F2"/>
-            <w:tcMar>
-              <w:top w:w="80" w:type="dxa"/>
-              <w:left w:w="120" w:type="dxa"/>
-              <w:bottom w:w="80" w:type="dxa"/>
-              <w:right w:w="120" w:type="dxa"/>
-            </w:tcMar>
-          </w:tcPr>
-          <w:p>
-            <w:r>
-              <w:rPr>
-                <w:b/>
-                <w:bCs/>
-                <w:color w:val="1E6091"/>
-                <w:sz w:val="20"/>
-                <w:szCs w:val="20"/>
-              </w:rPr>
-              <w:t>ENH-28</w:t>
-            </w:r>
-          </w:p>
-        </w:tc>
-        <w:tc>
-          <w:tcPr>
-            <w:tcW w:w="3200" w:type="dxa"/>
-            <w:tcBorders>
-              <w:top w:val="single" w:sz="1" w:space="0" w:color="DDDDDD"/>
-              <w:left w:val="single" w:sz="1" w:space="0" w:color="DDDDDD"/>
-              <w:bottom w:val="single" w:sz="1" w:space="0" w:color="DDDDDD"/>
-              <w:right w:val="single" w:sz="1" w:space="0" w:color="DDDDDD"/>
-            </w:tcBorders>
-            <w:shd w:val="clear" w:color="auto" w:fill="F2F2F2"/>
-            <w:tcMar>
-              <w:top w:w="80" w:type="dxa"/>
-              <w:left w:w="120" w:type="dxa"/>
-              <w:bottom w:w="80" w:type="dxa"/>
-              <w:right w:w="120" w:type="dxa"/>
-            </w:tcMar>
-          </w:tcPr>
-          <w:p>
-            <w:r>
-              <w:rPr>
-                <w:color w:val="000000"/>
-                <w:sz w:val="20"/>
-                <w:szCs w:val="20"/>
-              </w:rPr>
-              <w:t>Interactive CLI — prompt-based universe/filter selection instead of flags-only</w:t>
-            </w:r>
-          </w:p>
-        </w:tc>
-        <w:tc>
-          <w:tcPr>
-            <w:tcW w:w="1400" w:type="dxa"/>
-            <w:tcBorders>
-              <w:top w:val="single" w:sz="1" w:space="0" w:color="DDDDDD"/>
-              <w:left w:val="single" w:sz="1" w:space="0" w:color="DDDDDD"/>
-              <w:bottom w:val="single" w:sz="1" w:space="0" w:color="DDDDDD"/>
-              <w:right w:val="single" w:sz="1" w:space="0" w:color="DDDDDD"/>
-            </w:tcBorders>
-            <w:shd w:val="clear" w:color="auto" w:fill="F2F2F2"/>
-            <w:tcMar>
-              <w:top w:w="80" w:type="dxa"/>
-              <w:left w:w="120" w:type="dxa"/>
-              <w:bottom w:w="80" w:type="dxa"/>
-              <w:right w:w="120" w:type="dxa"/>
-            </w:tcMar>
-          </w:tcPr>
-          <w:p>
-            <w:r>
-              <w:rPr>
-                <w:b/>
-                <w:bCs/>
-                <w:color w:val="595959"/>
-                <w:sz w:val="19"/>
-                <w:szCs w:val="19"/>
-              </w:rPr>
-              <w:t>P4 — Low</w:t>
-            </w:r>
-          </w:p>
-        </w:tc>
-        <w:tc>
-          <w:tcPr>
-            <w:tcW w:w="1100" w:type="dxa"/>
-            <w:tcBorders>
-              <w:top w:val="single" w:sz="1" w:space="0" w:color="DDDDDD"/>
-              <w:left w:val="single" w:sz="1" w:space="0" w:color="DDDDDD"/>
-              <w:bottom w:val="single" w:sz="1" w:space="0" w:color="DDDDDD"/>
-              <w:right w:val="single" w:sz="1" w:space="0" w:color="DDDDDD"/>
-            </w:tcBorders>
-            <w:shd w:val="clear" w:color="auto" w:fill="F2F2F2"/>
-            <w:tcMar>
-              <w:top w:w="80" w:type="dxa"/>
-              <w:left w:w="120" w:type="dxa"/>
-              <w:bottom w:w="80" w:type="dxa"/>
-              <w:right w:w="120" w:type="dxa"/>
-            </w:tcMar>
-          </w:tcPr>
-          <w:p>
-            <w:r>
-              <w:rPr>
-                <w:color w:val="000000"/>
-                <w:sz w:val="20"/>
-                <w:szCs w:val="20"/>
-              </w:rPr>
-              <w:t>Low</w:t>
-            </w:r>
-          </w:p>
-        </w:tc>
-        <w:tc>
-          <w:tcPr>
-            <w:tcW w:w="1100" w:type="dxa"/>
-            <w:tcBorders>
-              <w:top w:val="single" w:sz="1" w:space="0" w:color="DDDDDD"/>
-              <w:left w:val="single" w:sz="1" w:space="0" w:color="DDDDDD"/>
-              <w:bottom w:val="single" w:sz="1" w:space="0" w:color="DDDDDD"/>
-              <w:right w:val="single" w:sz="1" w:space="0" w:color="DDDDDD"/>
-            </w:tcBorders>
-            <w:shd w:val="clear" w:color="auto" w:fill="F2F2F2"/>
-            <w:tcMar>
-              <w:top w:w="80" w:type="dxa"/>
-              <w:left w:w="120" w:type="dxa"/>
-              <w:bottom w:w="80" w:type="dxa"/>
-              <w:right w:w="120" w:type="dxa"/>
-            </w:tcMar>
-          </w:tcPr>
-          <w:p>
-            <w:r>
-              <w:rPr>
-                <w:color w:val="000000"/>
-                <w:sz w:val="20"/>
-                <w:szCs w:val="20"/>
-              </w:rPr>
-              <w:t>Low</w:t>
-            </w:r>
-          </w:p>
-        </w:tc>
-        <w:tc>
-          <w:tcPr>
-            <w:tcW w:w="1560" w:type="dxa"/>
-            <w:tcBorders>
-              <w:top w:val="single" w:sz="1" w:space="0" w:color="DDDDDD"/>
-              <w:left w:val="single" w:sz="1" w:space="0" w:color="DDDDDD"/>
-              <w:bottom w:val="single" w:sz="1" w:space="0" w:color="DDDDDD"/>
-              <w:right w:val="single" w:sz="1" w:space="0" w:color="DDDDDD"/>
-            </w:tcBorders>
-            <w:shd w:val="clear" w:color="auto" w:fill="F2F2F2"/>
-            <w:tcMar>
-              <w:top w:w="80" w:type="dxa"/>
-              <w:left w:w="120" w:type="dxa"/>
-              <w:bottom w:w="80" w:type="dxa"/>
-              <w:right w:w="120" w:type="dxa"/>
-            </w:tcMar>
-          </w:tcPr>
-          <w:p>
-            <w:r>
-              <w:rPr>
+            <w:shd w:val="clear" w:color="auto" w:fill="F2F2F2"/>
+            <w:tcMar>
+              <w:top w:w="80" w:type="dxa"/>
+              <w:left w:w="120" w:type="dxa"/>
+              <w:bottom w:w="80" w:type="dxa"/>
+              <w:right w:w="120" w:type="dxa"/>
+            </w:tcMar>
+          </w:tcPr>
+          <w:p>
+            <w:pPr>
+              <w:rPr>
+                <w:strike/>
+              </w:rPr>
+            </w:pPr>
+            <w:r>
+              <w:rPr>
+                <w:strike/>
                 <w:color w:val="000000"/>
                 <w:sz w:val="20"/>
                 <w:szCs w:val="20"/>

</xml_diff>